<commit_message>
docs: registrar el archivo instalable de Android y la rutina de verificacion previa
Se documenta la compilacion del archivo instalable, su tamano y requisitos, la optimizacion de recursos de la compilacion y las dos constancias que dejo: la migracion pendiente del complemento Gradle de Kotlin en dos complementos y la firma con clave de depuracion. Se registra tambien el episodio del error de tipos y la rutina que fijo: analizar antes de publicar.
</commit_message>
<xml_diff>
--- a/docs/13_EVIDENCIAS_DE_LA_ENTREGA.docx
+++ b/docs/13_EVIDENCIAS_DE_LA_ENTREGA.docx
@@ -2107,6 +2107,367 @@
       </w:tr>
     </w:tbl>
     <w:p/>
+    <w:p>
+      <w:r>
+        <w:rPr>
+          <w:b w:val="0"/>
+          <w:color w:val="555555"/>
+          <w:sz w:val="18"/>
+        </w:rPr>
+        <w:t>____________________________________________________________</w:t>
+      </w:r>
+    </w:p>
+    <w:p>
+      <w:pPr>
+        <w:pStyle w:val="Heading1"/>
+      </w:pPr>
+      <w:r>
+        <w:t>Archivo instalable de Android (APK)</w:t>
+      </w:r>
+    </w:p>
+    <w:tbl>
+      <w:tblPr>
+        <w:tblStyle w:val="TableGrid"/>
+        <w:tblW w:type="auto" w:w="0"/>
+        <w:jc w:val="center"/>
+        <w:tblLook w:firstColumn="1" w:firstRow="1" w:lastColumn="0" w:lastRow="0" w:noHBand="0" w:noVBand="1" w:val="04A0"/>
+      </w:tblPr>
+      <w:tblGrid>
+        <w:gridCol w:w="4320"/>
+        <w:gridCol w:w="4320"/>
+      </w:tblGrid>
+      <w:tr>
+        <w:tc>
+          <w:tcPr>
+            <w:tcW w:type="dxa" w:w="4320"/>
+          </w:tcPr>
+          <w:p>
+            <w:r>
+              <w:rPr>
+                <w:b/>
+                <w:sz w:val="20"/>
+              </w:rPr>
+              <w:t>Dato</w:t>
+            </w:r>
+          </w:p>
+        </w:tc>
+        <w:tc>
+          <w:tcPr>
+            <w:tcW w:type="dxa" w:w="4320"/>
+          </w:tcPr>
+          <w:p>
+            <w:r>
+              <w:rPr>
+                <w:b/>
+                <w:sz w:val="20"/>
+              </w:rPr>
+              <w:t>Valor</w:t>
+            </w:r>
+          </w:p>
+        </w:tc>
+      </w:tr>
+      <w:tr>
+        <w:tc>
+          <w:tcPr>
+            <w:tcW w:type="dxa" w:w="4320"/>
+          </w:tcPr>
+          <w:p>
+            <w:r>
+              <w:rPr>
+                <w:b w:val="0"/>
+                <w:sz w:val="20"/>
+              </w:rPr>
+              <w:t>Archivo</w:t>
+            </w:r>
+          </w:p>
+        </w:tc>
+        <w:tc>
+          <w:tcPr>
+            <w:tcW w:type="dxa" w:w="4320"/>
+          </w:tcPr>
+          <w:p>
+            <w:r>
+              <w:rPr>
+                <w:b w:val="0"/>
+                <w:sz w:val="20"/>
+              </w:rPr>
+              <w:t>build/app/outputs/flutter-apk/app-release.apk</w:t>
+            </w:r>
+          </w:p>
+        </w:tc>
+      </w:tr>
+      <w:tr>
+        <w:tc>
+          <w:tcPr>
+            <w:tcW w:type="dxa" w:w="4320"/>
+          </w:tcPr>
+          <w:p>
+            <w:r>
+              <w:rPr>
+                <w:b w:val="0"/>
+                <w:sz w:val="20"/>
+              </w:rPr>
+              <w:t>Tamaño</w:t>
+            </w:r>
+          </w:p>
+        </w:tc>
+        <w:tc>
+          <w:tcPr>
+            <w:tcW w:type="dxa" w:w="4320"/>
+          </w:tcPr>
+          <w:p>
+            <w:r>
+              <w:rPr>
+                <w:b w:val="0"/>
+                <w:sz w:val="20"/>
+              </w:rPr>
+              <w:t>53,8 MB</w:t>
+            </w:r>
+          </w:p>
+        </w:tc>
+      </w:tr>
+      <w:tr>
+        <w:tc>
+          <w:tcPr>
+            <w:tcW w:type="dxa" w:w="4320"/>
+          </w:tcPr>
+          <w:p>
+            <w:r>
+              <w:rPr>
+                <w:b w:val="0"/>
+                <w:sz w:val="20"/>
+              </w:rPr>
+              <w:t>Compilación</w:t>
+            </w:r>
+          </w:p>
+        </w:tc>
+        <w:tc>
+          <w:tcPr>
+            <w:tcW w:type="dxa" w:w="4320"/>
+          </w:tcPr>
+          <w:p>
+            <w:r>
+              <w:rPr>
+                <w:b w:val="0"/>
+                <w:sz w:val="20"/>
+              </w:rPr>
+              <w:t>flutter build apk --release --dart-define=API_BASE_URL=https://sigvach-api.onrender.com</w:t>
+            </w:r>
+          </w:p>
+        </w:tc>
+      </w:tr>
+      <w:tr>
+        <w:tc>
+          <w:tcPr>
+            <w:tcW w:type="dxa" w:w="4320"/>
+          </w:tcPr>
+          <w:p>
+            <w:r>
+              <w:rPr>
+                <w:b w:val="0"/>
+                <w:sz w:val="20"/>
+              </w:rPr>
+              <w:t>Firma</w:t>
+            </w:r>
+          </w:p>
+        </w:tc>
+        <w:tc>
+          <w:tcPr>
+            <w:tcW w:type="dxa" w:w="4320"/>
+          </w:tcPr>
+          <w:p>
+            <w:r>
+              <w:rPr>
+                <w:b w:val="0"/>
+                <w:sz w:val="20"/>
+              </w:rPr>
+              <w:t>Con la clave de depuración (ver la nota de revisión del apartado 2.7 de la monografía)</w:t>
+            </w:r>
+          </w:p>
+        </w:tc>
+      </w:tr>
+      <w:tr>
+        <w:tc>
+          <w:tcPr>
+            <w:tcW w:type="dxa" w:w="4320"/>
+          </w:tcPr>
+          <w:p>
+            <w:r>
+              <w:rPr>
+                <w:b w:val="0"/>
+                <w:sz w:val="20"/>
+              </w:rPr>
+              <w:t>Requisito de sistema</w:t>
+            </w:r>
+          </w:p>
+        </w:tc>
+        <w:tc>
+          <w:tcPr>
+            <w:tcW w:type="dxa" w:w="4320"/>
+          </w:tcPr>
+          <w:p>
+            <w:r>
+              <w:rPr>
+                <w:b w:val="0"/>
+                <w:sz w:val="20"/>
+              </w:rPr>
+              <w:t>Android 8.0 (API 26) o superior, conforme al RNF-04</w:t>
+            </w:r>
+          </w:p>
+        </w:tc>
+      </w:tr>
+    </w:tbl>
+    <w:p/>
+    <w:p>
+      <w:r>
+        <w:rPr>
+          <w:b w:val="0"/>
+          <w:sz w:val="22"/>
+        </w:rPr>
+        <w:t>El archivo se compila apuntando al servicio publicado, de modo que la aplicación</w:t>
+      </w:r>
+    </w:p>
+    <w:p>
+      <w:r>
+        <w:rPr>
+          <w:b w:val="0"/>
+          <w:sz w:val="22"/>
+        </w:rPr>
+        <w:t>instalada funciona desde cualquier red con acceso a internet y no requiere que el</w:t>
+      </w:r>
+    </w:p>
+    <w:p>
+      <w:r>
+        <w:rPr>
+          <w:b w:val="0"/>
+          <w:sz w:val="22"/>
+        </w:rPr>
+        <w:t>equipo del autor esté encendido.</w:t>
+      </w:r>
+    </w:p>
+    <w:p>
+      <w:r>
+        <w:rPr>
+          <w:b w:val="0"/>
+          <w:sz w:val="22"/>
+        </w:rPr>
+        <w:t>Cómo se instala</w:t>
+      </w:r>
+    </w:p>
+    <w:p>
+      <w:pPr>
+        <w:pStyle w:val="ListNumber"/>
+      </w:pPr>
+      <w:r>
+        <w:rPr>
+          <w:b w:val="0"/>
+          <w:sz w:val="22"/>
+        </w:rPr>
+        <w:t>Copiar el archivo al teléfono (cable, almacenamiento o mensajería).</w:t>
+      </w:r>
+    </w:p>
+    <w:p>
+      <w:pPr>
+        <w:pStyle w:val="ListNumber"/>
+      </w:pPr>
+      <w:r>
+        <w:rPr>
+          <w:b w:val="0"/>
+          <w:sz w:val="22"/>
+        </w:rPr>
+        <w:t>Abrirlo desde el teléfono y aceptar la instalación de aplicaciones de origen desconocido.</w:t>
+      </w:r>
+    </w:p>
+    <w:p>
+      <w:pPr>
+        <w:pStyle w:val="ListNumber"/>
+      </w:pPr>
+      <w:r>
+        <w:rPr>
+          <w:b w:val="0"/>
+          <w:sz w:val="22"/>
+        </w:rPr>
+        <w:t>Iniciar sesión con una cuenta del sistema y comprobar que el panel muestra las</w:t>
+      </w:r>
+    </w:p>
+    <w:p>
+      <w:r>
+        <w:rPr>
+          <w:b w:val="0"/>
+          <w:sz w:val="22"/>
+        </w:rPr>
+        <w:t>variables del módulo con sus valores y estados.</w:t>
+      </w:r>
+    </w:p>
+    <w:p>
+      <w:r>
+        <w:rPr>
+          <w:b w:val="0"/>
+          <w:sz w:val="22"/>
+        </w:rPr>
+        <w:t>Observaciones de la compilación</w:t>
+      </w:r>
+    </w:p>
+    <w:p>
+      <w:pPr>
+        <w:pStyle w:val="ListBullet"/>
+      </w:pPr>
+      <w:r>
+        <w:rPr>
+          <w:b w:val="0"/>
+          <w:sz w:val="22"/>
+        </w:rPr>
+        <w:t>La compilación descarta los recursos no utilizados: el paquete de iconos se</w:t>
+      </w:r>
+    </w:p>
+    <w:p>
+      <w:r>
+        <w:rPr>
+          <w:b w:val="0"/>
+          <w:sz w:val="22"/>
+        </w:rPr>
+        <w:t>redujo un 99,4 % (de 1.645.184 a 10.184 bytes).</w:t>
+      </w:r>
+    </w:p>
+    <w:p>
+      <w:pPr>
+        <w:pStyle w:val="ListBullet"/>
+      </w:pPr>
+      <w:r>
+        <w:rPr>
+          <w:b w:val="0"/>
+          <w:sz w:val="22"/>
+        </w:rPr>
+        <w:t>Los complementos firebase_auth y firebase_core aplican hoy el complemento</w:t>
+      </w:r>
+    </w:p>
+    <w:p>
+      <w:r>
+        <w:rPr>
+          <w:b w:val="0"/>
+          <w:sz w:val="22"/>
+        </w:rPr>
+        <w:t>Gradle de Kotlin de forma directa; una versión próxima de Flutter pedirá migrarlos</w:t>
+      </w:r>
+    </w:p>
+    <w:p>
+      <w:r>
+        <w:rPr>
+          <w:b w:val="0"/>
+          <w:sz w:val="22"/>
+        </w:rPr>
+        <w:t>al complemento integrado. Se deja constancia como tarea de mantenimiento y no</w:t>
+      </w:r>
+    </w:p>
+    <w:p>
+      <w:r>
+        <w:rPr>
+          <w:b w:val="0"/>
+          <w:sz w:val="22"/>
+        </w:rPr>
+        <w:t>afecta al funcionamiento actual.</w:t>
+      </w:r>
+    </w:p>
     <w:sectPr>
       <w:pgSz w:w="12240" w:h="15840"/>
       <w:pgMar w:top="1440" w:right="1800" w:bottom="1440" w:left="1800" w:header="720" w:footer="720" w:gutter="0"/>

</xml_diff>